<commit_message>
First commit after rejection. Edited abstract and first page
</commit_message>
<xml_diff>
--- a/writings/Finding_a_Job/In_one_Year/Sighted_Finding_a_job_in_a_year.docx
+++ b/writings/Finding_a_Job/In_one_Year/Sighted_Finding_a_job_in_a_year.docx
@@ -1,6 +1,6 @@
 
 <file path=word/document.xml><?xml version="1.0" encoding="utf-8"?>
-<w:document xmlns:wpc="http://schemas.microsoft.com/office/word/2010/wordprocessingCanvas" xmlns:cx="http://schemas.microsoft.com/office/drawing/2014/chartex" xmlns:cx1="http://schemas.microsoft.com/office/drawing/2015/9/8/chartex" xmlns:cx2="http://schemas.microsoft.com/office/drawing/2015/10/21/chartex" xmlns:cx3="http://schemas.microsoft.com/office/drawing/2016/5/9/chartex" xmlns:cx4="http://schemas.microsoft.com/office/drawing/2016/5/10/chartex" xmlns:cx5="http://schemas.microsoft.com/office/drawing/2016/5/11/chartex" xmlns:cx6="http://schemas.microsoft.com/office/drawing/2016/5/12/chartex" xmlns:cx7="http://schemas.microsoft.com/office/drawing/2016/5/13/chartex" xmlns:cx8="http://schemas.microsoft.com/office/drawing/2016/5/14/chartex" xmlns:mc="http://schemas.openxmlformats.org/markup-compatibility/2006" xmlns:aink="http://schemas.microsoft.com/office/drawing/2016/ink" xmlns:am3d="http://schemas.microsoft.com/office/drawing/2017/model3d" xmlns:o="urn:schemas-microsoft-com:office:office" xmlns:oel="http://schemas.microsoft.com/office/2019/extlst" xmlns:r="http://schemas.openxmlformats.org/officeDocument/2006/relationships" xmlns:m="http://schemas.openxmlformats.org/officeDocument/2006/math" xmlns:v="urn:schemas-microsoft-com:vml" xmlns:wp14="http://schemas.microsoft.com/office/word/2010/wordprocessingDrawing" xmlns:wp="http://schemas.openxmlformats.org/drawingml/2006/wordprocessingDrawing" xmlns:w10="urn:schemas-microsoft-com:office:word" xmlns:w="http://schemas.openxmlformats.org/wordprocessingml/2006/main" xmlns:w14="http://schemas.microsoft.com/office/word/2010/wordml" xmlns:w15="http://schemas.microsoft.com/office/word/2012/wordml" xmlns:w16cex="http://schemas.microsoft.com/office/word/2018/wordml/cex" xmlns:w16cid="http://schemas.microsoft.com/office/word/2016/wordml/cid" xmlns:w16="http://schemas.microsoft.com/office/word/2018/wordml" xmlns:w16sdtdh="http://schemas.microsoft.com/office/word/2020/wordml/sdtdatahash" xmlns:w16se="http://schemas.microsoft.com/office/word/2015/wordml/symex" xmlns:wpg="http://schemas.microsoft.com/office/word/2010/wordprocessingGroup" xmlns:wpi="http://schemas.microsoft.com/office/word/2010/wordprocessingInk" xmlns:wne="http://schemas.microsoft.com/office/word/2006/wordml" xmlns:wps="http://schemas.microsoft.com/office/word/2010/wordprocessingShape" mc:Ignorable="w14 w15 w16se w16cid w16 w16cex w16sdtdh wp14">
+<w:document xmlns:wpc="http://schemas.microsoft.com/office/word/2010/wordprocessingCanvas" xmlns:cx="http://schemas.microsoft.com/office/drawing/2014/chartex" xmlns:cx1="http://schemas.microsoft.com/office/drawing/2015/9/8/chartex" xmlns:cx2="http://schemas.microsoft.com/office/drawing/2015/10/21/chartex" xmlns:cx3="http://schemas.microsoft.com/office/drawing/2016/5/9/chartex" xmlns:cx4="http://schemas.microsoft.com/office/drawing/2016/5/10/chartex" xmlns:cx5="http://schemas.microsoft.com/office/drawing/2016/5/11/chartex" xmlns:cx6="http://schemas.microsoft.com/office/drawing/2016/5/12/chartex" xmlns:cx7="http://schemas.microsoft.com/office/drawing/2016/5/13/chartex" xmlns:cx8="http://schemas.microsoft.com/office/drawing/2016/5/14/chartex" xmlns:mc="http://schemas.openxmlformats.org/markup-compatibility/2006" xmlns:aink="http://schemas.microsoft.com/office/drawing/2016/ink" xmlns:am3d="http://schemas.microsoft.com/office/drawing/2017/model3d" xmlns:o="urn:schemas-microsoft-com:office:office" xmlns:oel="http://schemas.microsoft.com/office/2019/extlst" xmlns:r="http://schemas.openxmlformats.org/officeDocument/2006/relationships" xmlns:m="http://schemas.openxmlformats.org/officeDocument/2006/math" xmlns:v="urn:schemas-microsoft-com:vml" xmlns:wp14="http://schemas.microsoft.com/office/word/2010/wordprocessingDrawing" xmlns:wp="http://schemas.openxmlformats.org/drawingml/2006/wordprocessingDrawing" xmlns:w10="urn:schemas-microsoft-com:office:word" xmlns:w="http://schemas.openxmlformats.org/wordprocessingml/2006/main" xmlns:w14="http://schemas.microsoft.com/office/word/2010/wordml" xmlns:w15="http://schemas.microsoft.com/office/word/2012/wordml" xmlns:w16cex="http://schemas.microsoft.com/office/word/2018/wordml/cex" xmlns:w16cid="http://schemas.microsoft.com/office/word/2016/wordml/cid" xmlns:w16="http://schemas.microsoft.com/office/word/2018/wordml" xmlns:w16du="http://schemas.microsoft.com/office/word/2023/wordml/word16du" xmlns:w16sdtdh="http://schemas.microsoft.com/office/word/2020/wordml/sdtdatahash" xmlns:w16se="http://schemas.microsoft.com/office/word/2015/wordml/symex" xmlns:wpg="http://schemas.microsoft.com/office/word/2010/wordprocessingGroup" xmlns:wpi="http://schemas.microsoft.com/office/word/2010/wordprocessingInk" xmlns:wne="http://schemas.microsoft.com/office/word/2006/wordml" xmlns:wps="http://schemas.microsoft.com/office/word/2010/wordprocessingShape" mc:Ignorable="w14 w15 w16se w16cid w16 w16cex w16sdtdh w16du wp14">
   <w:body>
     <w:p>
       <w:pPr>
@@ -81,7 +81,7 @@
           <w:sz w:val="24"/>
           <w:szCs w:val="24"/>
         </w:rPr>
-        <w:t xml:space="preserve">Refugee research frequently asserts outcomes for refugees recently resettled to the U.S. are predicted only by context effects, at least in the short term (they arrive as “blank slates”). In contrast, segmented assimilation theory contends that assimilation is stratified by education and work histories, as well as by context effects. I analyze these contending predictions with the Annual Survey of </w:t>
+        <w:t>Refugee research frequently asserts outcomes for refugees recently resettled to the U.S. are predicted only by context effects, at least in the short term (they arrive as “blank slates”).</w:t>
       </w:r>
       <w:r>
         <w:rPr>
@@ -92,25 +92,183 @@
           <w:sz w:val="24"/>
           <w:szCs w:val="24"/>
         </w:rPr>
-        <w:t xml:space="preserve">Refugees (n=6035 households) and contrast these theoretical expectations through logit modeling of whether a refugee household obtains a job within the first year of resettlement. I find the most support for the blank slate hypothesis. </w:t>
+        <w:t xml:space="preserve"> </w:t>
       </w:r>
       <w:r>
         <w:rPr>
           <w:rFonts w:ascii="Times New Roman" w:eastAsia="Times New Roman" w:hAnsi="Times New Roman" w:cs="Times New Roman"/>
           <w:i/>
           <w:iCs/>
-          <w:sz w:val="24"/>
-          <w:szCs w:val="24"/>
-        </w:rPr>
-        <w:t>Ostensibly powerful predictors favored by segmented assimilation theory such as years of education and most aspects of English language proficiency were insignificant predictors in the final model. Refugee characteristics mattered in this analysis, but some of the ubiquitous and ostensibly powerful predictors of economic assimilation were insignificant predictors.</w:t>
-      </w:r>
-      <w:r>
-        <w:rPr>
-          <w:rFonts w:ascii="Times New Roman" w:eastAsia="Times New Roman" w:hAnsi="Times New Roman" w:cs="Times New Roman"/>
-          <w:sz w:val="24"/>
-          <w:szCs w:val="24"/>
-        </w:rPr>
-        <w:t> </w:t>
+          <w:color w:val="000000"/>
+          <w:sz w:val="24"/>
+          <w:szCs w:val="24"/>
+        </w:rPr>
+        <w:t>However,</w:t>
+      </w:r>
+      <w:r>
+        <w:rPr>
+          <w:rFonts w:ascii="Times New Roman" w:eastAsia="Times New Roman" w:hAnsi="Times New Roman" w:cs="Times New Roman"/>
+          <w:i/>
+          <w:iCs/>
+          <w:color w:val="000000"/>
+          <w:sz w:val="24"/>
+          <w:szCs w:val="24"/>
+        </w:rPr>
+        <w:t xml:space="preserve"> little is known theoretically about the</w:t>
+      </w:r>
+      <w:r>
+        <w:rPr>
+          <w:rFonts w:ascii="Times New Roman" w:eastAsia="Times New Roman" w:hAnsi="Times New Roman" w:cs="Times New Roman"/>
+          <w:i/>
+          <w:iCs/>
+          <w:color w:val="000000"/>
+          <w:sz w:val="24"/>
+          <w:szCs w:val="24"/>
+        </w:rPr>
+        <w:t xml:space="preserve"> extent or duration of this blank slate effect</w:t>
+      </w:r>
+      <w:r>
+        <w:rPr>
+          <w:rFonts w:ascii="Times New Roman" w:eastAsia="Times New Roman" w:hAnsi="Times New Roman" w:cs="Times New Roman"/>
+          <w:i/>
+          <w:iCs/>
+          <w:color w:val="000000"/>
+          <w:sz w:val="24"/>
+          <w:szCs w:val="24"/>
+        </w:rPr>
+        <w:t xml:space="preserve">, or which outcomes will be </w:t>
+      </w:r>
+      <w:r>
+        <w:rPr>
+          <w:rFonts w:ascii="Times New Roman" w:eastAsia="Times New Roman" w:hAnsi="Times New Roman" w:cs="Times New Roman"/>
+          <w:i/>
+          <w:iCs/>
+          <w:color w:val="000000"/>
+          <w:sz w:val="24"/>
+          <w:szCs w:val="24"/>
+        </w:rPr>
+        <w:t>a</w:t>
+      </w:r>
+      <w:r>
+        <w:rPr>
+          <w:rFonts w:ascii="Times New Roman" w:eastAsia="Times New Roman" w:hAnsi="Times New Roman" w:cs="Times New Roman"/>
+          <w:i/>
+          <w:iCs/>
+          <w:color w:val="000000"/>
+          <w:sz w:val="24"/>
+          <w:szCs w:val="24"/>
+        </w:rPr>
+        <w:t>ffected by it</w:t>
+      </w:r>
+      <w:r>
+        <w:rPr>
+          <w:rFonts w:ascii="Times New Roman" w:eastAsia="Times New Roman" w:hAnsi="Times New Roman" w:cs="Times New Roman"/>
+          <w:i/>
+          <w:iCs/>
+          <w:color w:val="000000"/>
+          <w:sz w:val="24"/>
+          <w:szCs w:val="24"/>
+        </w:rPr>
+        <w:t>.</w:t>
+      </w:r>
+      <w:r>
+        <w:rPr>
+          <w:rFonts w:ascii="Times New Roman" w:eastAsia="Times New Roman" w:hAnsi="Times New Roman" w:cs="Times New Roman"/>
+          <w:i/>
+          <w:iCs/>
+          <w:color w:val="000000"/>
+          <w:sz w:val="24"/>
+          <w:szCs w:val="24"/>
+        </w:rPr>
+        <w:t xml:space="preserve"> Concerning policy and empirical concerns, quantitative work describing the economic outcomes of refugee households resettled to the United States is sparse. To address these limitations,</w:t>
+      </w:r>
+      <w:r>
+        <w:rPr>
+          <w:rFonts w:ascii="Times New Roman" w:eastAsia="Times New Roman" w:hAnsi="Times New Roman" w:cs="Times New Roman"/>
+          <w:i/>
+          <w:iCs/>
+          <w:color w:val="000000"/>
+          <w:sz w:val="24"/>
+          <w:szCs w:val="24"/>
+        </w:rPr>
+        <w:t xml:space="preserve"> I </w:t>
+      </w:r>
+      <w:r>
+        <w:rPr>
+          <w:rFonts w:ascii="Times New Roman" w:eastAsia="Times New Roman" w:hAnsi="Times New Roman" w:cs="Times New Roman"/>
+          <w:i/>
+          <w:iCs/>
+          <w:color w:val="000000"/>
+          <w:sz w:val="24"/>
+          <w:szCs w:val="24"/>
+        </w:rPr>
+        <w:t>use</w:t>
+      </w:r>
+      <w:r>
+        <w:rPr>
+          <w:rFonts w:ascii="Times New Roman" w:eastAsia="Times New Roman" w:hAnsi="Times New Roman" w:cs="Times New Roman"/>
+          <w:i/>
+          <w:iCs/>
+          <w:color w:val="000000"/>
+          <w:sz w:val="24"/>
+          <w:szCs w:val="24"/>
+        </w:rPr>
+        <w:t xml:space="preserve"> the Annual Survey of </w:t>
+      </w:r>
+      <w:r>
+        <w:rPr>
+          <w:rFonts w:ascii="Times New Roman" w:eastAsia="Times New Roman" w:hAnsi="Times New Roman" w:cs="Times New Roman"/>
+          <w:i/>
+          <w:iCs/>
+          <w:color w:val="000000"/>
+          <w:sz w:val="24"/>
+          <w:szCs w:val="24"/>
+        </w:rPr>
+        <w:t xml:space="preserve">Refugees (n=6035 households) and </w:t>
+      </w:r>
+      <w:r>
+        <w:rPr>
+          <w:rFonts w:ascii="Times New Roman" w:eastAsia="Times New Roman" w:hAnsi="Times New Roman" w:cs="Times New Roman"/>
+          <w:i/>
+          <w:iCs/>
+          <w:color w:val="000000"/>
+          <w:sz w:val="24"/>
+          <w:szCs w:val="24"/>
+        </w:rPr>
+        <w:t>model</w:t>
+      </w:r>
+      <w:r>
+        <w:rPr>
+          <w:rFonts w:ascii="Times New Roman" w:eastAsia="Times New Roman" w:hAnsi="Times New Roman" w:cs="Times New Roman"/>
+          <w:i/>
+          <w:iCs/>
+          <w:color w:val="000000"/>
+          <w:sz w:val="24"/>
+          <w:szCs w:val="24"/>
+        </w:rPr>
+        <w:t xml:space="preserve"> whether a refugee household obtains a job within the first year of resettlement</w:t>
+      </w:r>
+      <w:r>
+        <w:rPr>
+          <w:rFonts w:ascii="Times New Roman" w:eastAsia="Times New Roman" w:hAnsi="Times New Roman" w:cs="Times New Roman"/>
+          <w:i/>
+          <w:iCs/>
+          <w:color w:val="000000"/>
+          <w:sz w:val="24"/>
+          <w:szCs w:val="24"/>
+        </w:rPr>
+        <w:t>.</w:t>
+      </w:r>
+      <w:r>
+        <w:rPr>
+          <w:rFonts w:ascii="Times New Roman" w:eastAsia="Times New Roman" w:hAnsi="Times New Roman" w:cs="Times New Roman"/>
+          <w:i/>
+          <w:iCs/>
+          <w:color w:val="000000"/>
+          <w:sz w:val="24"/>
+          <w:szCs w:val="24"/>
+        </w:rPr>
+        <w:t xml:space="preserve"> Theoretically, I find that the blank slate hypothesis does affect XXXX. Empirically, I find that households DR CONGO, ETC ETC. Opportunities to examine related outcomes and different time scales would contribute to our knowledge of the blank slate hypothesis and the factors associated with obtaining a job quickly. </w:t>
       </w:r>
     </w:p>
     <w:p>
@@ -372,139 +530,48 @@
           <w:sz w:val="24"/>
           <w:szCs w:val="24"/>
         </w:rPr>
-        <w:t xml:space="preserve">a fundamental way that host contexts support refugees. </w:t>
-      </w:r>
-      <w:r>
-        <w:rPr>
-          <w:rFonts w:ascii="Times New Roman" w:eastAsia="Times New Roman" w:hAnsi="Times New Roman" w:cs="Times New Roman"/>
-          <w:color w:val="000000"/>
-          <w:sz w:val="24"/>
-          <w:szCs w:val="24"/>
-        </w:rPr>
-        <w:t>Only after</w:t>
-      </w:r>
-      <w:r>
-        <w:rPr>
-          <w:rFonts w:ascii="Times New Roman" w:eastAsia="Times New Roman" w:hAnsi="Times New Roman" w:cs="Times New Roman"/>
-          <w:color w:val="000000"/>
-          <w:sz w:val="24"/>
-          <w:szCs w:val="24"/>
-        </w:rPr>
-        <w:t xml:space="preserve"> employment</w:t>
-      </w:r>
-      <w:r>
-        <w:rPr>
-          <w:rFonts w:ascii="Times New Roman" w:eastAsia="Times New Roman" w:hAnsi="Times New Roman" w:cs="Times New Roman"/>
-          <w:color w:val="000000"/>
-          <w:sz w:val="24"/>
-          <w:szCs w:val="24"/>
-        </w:rPr>
-        <w:t xml:space="preserve"> with a living wage can</w:t>
-      </w:r>
-      <w:r>
-        <w:rPr>
-          <w:rFonts w:ascii="Times New Roman" w:eastAsia="Times New Roman" w:hAnsi="Times New Roman" w:cs="Times New Roman"/>
-          <w:color w:val="000000"/>
-          <w:sz w:val="24"/>
-          <w:szCs w:val="24"/>
-        </w:rPr>
-        <w:t xml:space="preserve"> refugees </w:t>
-      </w:r>
-      <w:r>
-        <w:rPr>
-          <w:rFonts w:ascii="Times New Roman" w:eastAsia="Times New Roman" w:hAnsi="Times New Roman" w:cs="Times New Roman"/>
-          <w:color w:val="000000"/>
-          <w:sz w:val="24"/>
-          <w:szCs w:val="24"/>
-        </w:rPr>
-        <w:t>invest their time and resources into</w:t>
-      </w:r>
-      <w:r>
-        <w:rPr>
-          <w:rFonts w:ascii="Times New Roman" w:eastAsia="Times New Roman" w:hAnsi="Times New Roman" w:cs="Times New Roman"/>
-          <w:color w:val="000000"/>
-          <w:sz w:val="24"/>
-          <w:szCs w:val="24"/>
-        </w:rPr>
-        <w:t xml:space="preserve"> the host c</w:t>
-      </w:r>
-      <w:r>
-        <w:rPr>
-          <w:rFonts w:ascii="Times New Roman" w:eastAsia="Times New Roman" w:hAnsi="Times New Roman" w:cs="Times New Roman"/>
-          <w:color w:val="000000"/>
-          <w:sz w:val="24"/>
-          <w:szCs w:val="24"/>
-        </w:rPr>
-        <w:t>ountry or smaller context</w:t>
-      </w:r>
-      <w:r>
-        <w:rPr>
-          <w:rFonts w:ascii="Times New Roman" w:eastAsia="Times New Roman" w:hAnsi="Times New Roman" w:cs="Times New Roman"/>
-          <w:color w:val="000000"/>
-          <w:sz w:val="24"/>
-          <w:szCs w:val="24"/>
-        </w:rPr>
-        <w:t>.</w:t>
-      </w:r>
-      <w:r>
-        <w:rPr>
-          <w:rFonts w:ascii="Times New Roman" w:hAnsi="Times New Roman" w:cs="Times New Roman"/>
-          <w:sz w:val="24"/>
-          <w:szCs w:val="24"/>
-        </w:rPr>
-        <w:t xml:space="preserve"> Despite assistance from refugee service providers, very few refugees achieve a livable wage by the time they have been in the United States for five years</w:t>
-      </w:r>
-      <w:r>
-        <w:rPr>
-          <w:rFonts w:ascii="Times New Roman" w:hAnsi="Times New Roman" w:cs="Times New Roman"/>
-          <w:sz w:val="24"/>
-          <w:szCs w:val="24"/>
-        </w:rPr>
-        <w:t>.</w:t>
-      </w:r>
-      <w:r>
-        <w:rPr>
-          <w:rFonts w:ascii="Times New Roman" w:hAnsi="Times New Roman" w:cs="Times New Roman"/>
-          <w:sz w:val="24"/>
-          <w:szCs w:val="24"/>
-        </w:rPr>
-        <w:t xml:space="preserve"> When Young</w:t>
-      </w:r>
-      <w:r>
-        <w:rPr>
-          <w:rFonts w:ascii="Times New Roman" w:hAnsi="Times New Roman" w:cs="Times New Roman"/>
-          <w:sz w:val="24"/>
-          <w:szCs w:val="24"/>
-        </w:rPr>
-        <w:t xml:space="preserve"> (20</w:t>
-      </w:r>
-      <w:r>
-        <w:rPr>
-          <w:rFonts w:ascii="Times New Roman" w:hAnsi="Times New Roman" w:cs="Times New Roman"/>
-          <w:sz w:val="24"/>
-          <w:szCs w:val="24"/>
-        </w:rPr>
-        <w:t>20</w:t>
-      </w:r>
-      <w:r>
-        <w:rPr>
-          <w:rFonts w:ascii="Times New Roman" w:hAnsi="Times New Roman" w:cs="Times New Roman"/>
-          <w:sz w:val="24"/>
-          <w:szCs w:val="24"/>
-        </w:rPr>
-        <w:t>)</w:t>
-      </w:r>
-      <w:r>
-        <w:rPr>
-          <w:rFonts w:ascii="Times New Roman" w:hAnsi="Times New Roman" w:cs="Times New Roman"/>
-          <w:sz w:val="24"/>
-          <w:szCs w:val="24"/>
-        </w:rPr>
-        <w:t xml:space="preserve"> studied</w:t>
-      </w:r>
-      <w:r>
-        <w:rPr>
-          <w:rFonts w:ascii="Times New Roman" w:hAnsi="Times New Roman" w:cs="Times New Roman"/>
+        <w:t>a fundamental way that host contexts support refugees</w:t>
+      </w:r>
+      <w:r>
+        <w:rPr>
+          <w:rFonts w:ascii="Times New Roman" w:eastAsia="Times New Roman" w:hAnsi="Times New Roman" w:cs="Times New Roman"/>
+          <w:color w:val="000000"/>
+          <w:sz w:val="24"/>
+          <w:szCs w:val="24"/>
+        </w:rPr>
+        <w:t xml:space="preserve">. And reciprocally, </w:t>
+      </w:r>
+      <w:r>
+        <w:rPr>
+          <w:rFonts w:ascii="Times New Roman" w:eastAsia="Times New Roman" w:hAnsi="Times New Roman" w:cs="Times New Roman"/>
+          <w:color w:val="000000"/>
+          <w:sz w:val="24"/>
+          <w:szCs w:val="24"/>
+        </w:rPr>
+        <w:t xml:space="preserve">employed </w:t>
+      </w:r>
+      <w:r>
+        <w:rPr>
+          <w:rFonts w:ascii="Times New Roman" w:eastAsia="Times New Roman" w:hAnsi="Times New Roman" w:cs="Times New Roman"/>
+          <w:color w:val="000000"/>
+          <w:sz w:val="24"/>
+          <w:szCs w:val="24"/>
+        </w:rPr>
+        <w:t>refugees give</w:t>
+      </w:r>
+      <w:r>
+        <w:rPr>
+          <w:rFonts w:ascii="Times New Roman" w:eastAsia="Times New Roman" w:hAnsi="Times New Roman" w:cs="Times New Roman"/>
+          <w:color w:val="000000"/>
+          <w:sz w:val="24"/>
+          <w:szCs w:val="24"/>
+        </w:rPr>
+        <w:t xml:space="preserve"> their time and generate revenue</w:t>
+      </w:r>
+      <w:r>
+        <w:rPr>
+          <w:rFonts w:ascii="Times New Roman" w:eastAsia="Times New Roman" w:hAnsi="Times New Roman" w:cs="Times New Roman"/>
+          <w:color w:val="000000"/>
           <w:sz w:val="24"/>
           <w:szCs w:val="24"/>
         </w:rPr>
@@ -512,222 +579,66 @@
       </w:r>
       <w:r>
         <w:rPr>
-          <w:rFonts w:ascii="Times New Roman" w:hAnsi="Times New Roman" w:cs="Times New Roman"/>
-          <w:sz w:val="24"/>
-          <w:szCs w:val="24"/>
-        </w:rPr>
-        <w:t>refugees resettled to Utah</w:t>
-      </w:r>
-      <w:r>
-        <w:rPr>
-          <w:rFonts w:ascii="Times New Roman" w:hAnsi="Times New Roman" w:cs="Times New Roman"/>
-          <w:sz w:val="24"/>
-          <w:szCs w:val="24"/>
-        </w:rPr>
-        <w:t xml:space="preserve"> in the past five years</w:t>
-      </w:r>
-      <w:r>
-        <w:rPr>
-          <w:rFonts w:ascii="Times New Roman" w:hAnsi="Times New Roman" w:cs="Times New Roman"/>
-          <w:sz w:val="24"/>
-          <w:szCs w:val="24"/>
-        </w:rPr>
-        <w:t>, she found</w:t>
-      </w:r>
-      <w:r>
-        <w:rPr>
-          <w:rFonts w:ascii="Times New Roman" w:hAnsi="Times New Roman" w:cs="Times New Roman"/>
-          <w:sz w:val="24"/>
-          <w:szCs w:val="24"/>
-        </w:rPr>
-        <w:t xml:space="preserve"> </w:t>
-      </w:r>
-      <w:r>
-        <w:rPr>
-          <w:rFonts w:ascii="Times New Roman" w:hAnsi="Times New Roman" w:cs="Times New Roman"/>
-          <w:sz w:val="24"/>
-          <w:szCs w:val="24"/>
-        </w:rPr>
-        <w:t>o</w:t>
-      </w:r>
-      <w:r>
-        <w:rPr>
-          <w:rFonts w:ascii="Times New Roman" w:hAnsi="Times New Roman" w:cs="Times New Roman"/>
-          <w:sz w:val="24"/>
-          <w:szCs w:val="24"/>
-        </w:rPr>
-        <w:t>nly eight percent</w:t>
-      </w:r>
-      <w:r>
-        <w:rPr>
-          <w:rFonts w:ascii="Times New Roman" w:hAnsi="Times New Roman" w:cs="Times New Roman"/>
-          <w:sz w:val="24"/>
-          <w:szCs w:val="24"/>
-        </w:rPr>
-        <w:t xml:space="preserve"> </w:t>
-      </w:r>
-      <w:r>
-        <w:rPr>
-          <w:rFonts w:ascii="Times New Roman" w:hAnsi="Times New Roman" w:cs="Times New Roman"/>
-          <w:sz w:val="24"/>
-          <w:szCs w:val="24"/>
-        </w:rPr>
-        <w:t>had found jobs with a livable hourly wage, and only six percent had found livable-wage jobs that offered full-time hours.</w:t>
-      </w:r>
-      <w:r>
-        <w:rPr>
-          <w:rFonts w:ascii="Times New Roman" w:eastAsia="Times New Roman" w:hAnsi="Times New Roman" w:cs="Times New Roman"/>
-          <w:color w:val="000000"/>
-          <w:sz w:val="24"/>
-          <w:szCs w:val="24"/>
-        </w:rPr>
-        <w:t xml:space="preserve"> </w:t>
-      </w:r>
-      <w:r>
-        <w:rPr>
-          <w:rFonts w:ascii="Times New Roman" w:eastAsia="Times New Roman" w:hAnsi="Times New Roman" w:cs="Times New Roman"/>
-          <w:color w:val="000000"/>
-          <w:sz w:val="24"/>
-          <w:szCs w:val="24"/>
-        </w:rPr>
-        <w:t xml:space="preserve"> </w:t>
-      </w:r>
-    </w:p>
-    <w:p>
-      <w:pPr>
-        <w:spacing w:before="240" w:after="240" w:line="480" w:lineRule="auto"/>
-        <w:ind w:firstLine="720"/>
-        <w:rPr>
-          <w:rFonts w:ascii="Times New Roman" w:eastAsia="Times New Roman" w:hAnsi="Times New Roman" w:cs="Times New Roman"/>
-          <w:sz w:val="24"/>
-          <w:szCs w:val="24"/>
-        </w:rPr>
-      </w:pPr>
-      <w:r>
-        <w:rPr>
-          <w:rFonts w:ascii="Times New Roman" w:eastAsia="Times New Roman" w:hAnsi="Times New Roman" w:cs="Times New Roman"/>
-          <w:color w:val="000000"/>
-          <w:sz w:val="24"/>
-          <w:szCs w:val="24"/>
-        </w:rPr>
-        <w:t>Despite th</w:t>
-      </w:r>
-      <w:r>
-        <w:rPr>
-          <w:rFonts w:ascii="Times New Roman" w:eastAsia="Times New Roman" w:hAnsi="Times New Roman" w:cs="Times New Roman"/>
-          <w:color w:val="000000"/>
-          <w:sz w:val="24"/>
-          <w:szCs w:val="24"/>
-        </w:rPr>
-        <w:t>is</w:t>
-      </w:r>
-      <w:r>
-        <w:rPr>
-          <w:rFonts w:ascii="Times New Roman" w:eastAsia="Times New Roman" w:hAnsi="Times New Roman" w:cs="Times New Roman"/>
-          <w:color w:val="000000"/>
-          <w:sz w:val="24"/>
-          <w:szCs w:val="24"/>
-        </w:rPr>
-        <w:t xml:space="preserve"> difficulty, j</w:t>
-      </w:r>
-      <w:r>
-        <w:rPr>
-          <w:rFonts w:ascii="Times New Roman" w:eastAsia="Times New Roman" w:hAnsi="Times New Roman" w:cs="Times New Roman"/>
-          <w:color w:val="000000"/>
-          <w:sz w:val="24"/>
-          <w:szCs w:val="24"/>
-        </w:rPr>
-        <w:t>ob</w:t>
-      </w:r>
-      <w:r>
-        <w:rPr>
-          <w:rFonts w:ascii="Times New Roman" w:eastAsia="Times New Roman" w:hAnsi="Times New Roman" w:cs="Times New Roman"/>
-          <w:color w:val="000000"/>
-          <w:sz w:val="24"/>
-          <w:szCs w:val="24"/>
-        </w:rPr>
-        <w:t>s</w:t>
-      </w:r>
-      <w:r>
-        <w:rPr>
-          <w:rFonts w:ascii="Times New Roman" w:eastAsia="Times New Roman" w:hAnsi="Times New Roman" w:cs="Times New Roman"/>
-          <w:color w:val="000000"/>
-          <w:sz w:val="24"/>
-          <w:szCs w:val="24"/>
-        </w:rPr>
-        <w:t xml:space="preserve"> meet</w:t>
-      </w:r>
-      <w:r>
-        <w:rPr>
-          <w:rFonts w:ascii="Times New Roman" w:eastAsia="Times New Roman" w:hAnsi="Times New Roman" w:cs="Times New Roman"/>
-          <w:color w:val="000000"/>
-          <w:sz w:val="24"/>
-          <w:szCs w:val="24"/>
-        </w:rPr>
-        <w:t>ing</w:t>
-      </w:r>
-      <w:r>
-        <w:rPr>
-          <w:rFonts w:ascii="Times New Roman" w:eastAsia="Times New Roman" w:hAnsi="Times New Roman" w:cs="Times New Roman"/>
-          <w:color w:val="000000"/>
-          <w:sz w:val="24"/>
-          <w:szCs w:val="24"/>
-        </w:rPr>
-        <w:t xml:space="preserve"> the household’s needs </w:t>
-      </w:r>
-      <w:r>
-        <w:rPr>
-          <w:rFonts w:ascii="Times New Roman" w:eastAsia="Times New Roman" w:hAnsi="Times New Roman" w:cs="Times New Roman"/>
-          <w:color w:val="000000"/>
-          <w:sz w:val="24"/>
-          <w:szCs w:val="24"/>
-        </w:rPr>
-        <w:t>are</w:t>
-      </w:r>
-      <w:r>
-        <w:rPr>
-          <w:rFonts w:ascii="Times New Roman" w:eastAsia="Times New Roman" w:hAnsi="Times New Roman" w:cs="Times New Roman"/>
-          <w:color w:val="000000"/>
-          <w:sz w:val="24"/>
-          <w:szCs w:val="24"/>
-        </w:rPr>
-        <w:t xml:space="preserve"> critical. The United States resettlement agencies, under the direction of the State Department and Office of Refugee Resettlement</w:t>
-      </w:r>
-      <w:r>
-        <w:rPr>
-          <w:rFonts w:ascii="Times New Roman" w:eastAsia="Times New Roman" w:hAnsi="Times New Roman" w:cs="Times New Roman"/>
-          <w:color w:val="000000"/>
-          <w:sz w:val="24"/>
-          <w:szCs w:val="24"/>
-        </w:rPr>
-        <w:t>,</w:t>
-      </w:r>
-      <w:r>
-        <w:rPr>
-          <w:rFonts w:ascii="Times New Roman" w:eastAsia="Times New Roman" w:hAnsi="Times New Roman" w:cs="Times New Roman"/>
-          <w:color w:val="000000"/>
-          <w:sz w:val="24"/>
-          <w:szCs w:val="24"/>
-        </w:rPr>
-        <w:t xml:space="preserve"> encourage refugees to obtain</w:t>
-      </w:r>
-      <w:r>
-        <w:rPr>
-          <w:rFonts w:ascii="Times New Roman" w:eastAsia="Times New Roman" w:hAnsi="Times New Roman" w:cs="Times New Roman"/>
-          <w:color w:val="000000"/>
-          <w:sz w:val="24"/>
-          <w:szCs w:val="24"/>
-        </w:rPr>
-        <w:t xml:space="preserve"> a job</w:t>
-      </w:r>
-      <w:r>
-        <w:rPr>
-          <w:rFonts w:ascii="Times New Roman" w:eastAsia="Times New Roman" w:hAnsi="Times New Roman" w:cs="Times New Roman"/>
-          <w:color w:val="000000"/>
-          <w:sz w:val="24"/>
-          <w:szCs w:val="24"/>
-        </w:rPr>
-        <w:t xml:space="preserve"> as soon as possible</w:t>
+          <w:rFonts w:ascii="Times New Roman" w:eastAsia="Times New Roman" w:hAnsi="Times New Roman" w:cs="Times New Roman"/>
+          <w:color w:val="000000"/>
+          <w:sz w:val="24"/>
+          <w:szCs w:val="24"/>
+        </w:rPr>
+        <w:t xml:space="preserve">in </w:t>
+      </w:r>
+      <w:r>
+        <w:rPr>
+          <w:rFonts w:ascii="Times New Roman" w:eastAsia="Times New Roman" w:hAnsi="Times New Roman" w:cs="Times New Roman"/>
+          <w:color w:val="000000"/>
+          <w:sz w:val="24"/>
+          <w:szCs w:val="24"/>
+        </w:rPr>
+        <w:t>their</w:t>
+      </w:r>
+      <w:r>
+        <w:rPr>
+          <w:rFonts w:ascii="Times New Roman" w:eastAsia="Times New Roman" w:hAnsi="Times New Roman" w:cs="Times New Roman"/>
+          <w:color w:val="000000"/>
+          <w:sz w:val="24"/>
+          <w:szCs w:val="24"/>
+        </w:rPr>
+        <w:t xml:space="preserve"> new</w:t>
+      </w:r>
+      <w:r>
+        <w:rPr>
+          <w:rFonts w:ascii="Times New Roman" w:eastAsia="Times New Roman" w:hAnsi="Times New Roman" w:cs="Times New Roman"/>
+          <w:color w:val="000000"/>
+          <w:sz w:val="24"/>
+          <w:szCs w:val="24"/>
+        </w:rPr>
+        <w:t xml:space="preserve"> communities.</w:t>
+      </w:r>
+      <w:r>
+        <w:rPr>
+          <w:rFonts w:ascii="Times New Roman" w:eastAsia="Times New Roman" w:hAnsi="Times New Roman" w:cs="Times New Roman"/>
+          <w:color w:val="000000"/>
+          <w:sz w:val="24"/>
+          <w:szCs w:val="24"/>
+        </w:rPr>
+        <w:t xml:space="preserve"> The ideal situation is self-sufficiency</w:t>
+      </w:r>
+      <w:r>
+        <w:rPr>
+          <w:rFonts w:ascii="Times New Roman" w:eastAsia="Times New Roman" w:hAnsi="Times New Roman" w:cs="Times New Roman"/>
+          <w:color w:val="000000"/>
+          <w:sz w:val="24"/>
+          <w:szCs w:val="24"/>
+        </w:rPr>
+        <w:t>, living in the U.S. without being reliant on public assistance programs, and the path to this outcome is through obtaining employment early</w:t>
+      </w:r>
+      <w:r>
+        <w:rPr>
+          <w:rFonts w:ascii="Times New Roman" w:eastAsia="Times New Roman" w:hAnsi="Times New Roman" w:cs="Times New Roman"/>
+          <w:color w:val="000000"/>
+          <w:sz w:val="24"/>
+          <w:szCs w:val="24"/>
+        </w:rPr>
+        <w:t xml:space="preserve"> according to the U.S. State Department and Office of Refugee Resettlement</w:t>
       </w:r>
       <w:r>
         <w:rPr>
@@ -756,7 +667,279 @@
           <w:sz w:val="24"/>
           <w:szCs w:val="24"/>
         </w:rPr>
-        <w:t xml:space="preserve">. Refugees receive rent, food, and job search assistance for 30-90 </w:t>
+        <w:t>.</w:t>
+      </w:r>
+      <w:r>
+        <w:rPr>
+          <w:rFonts w:ascii="Times New Roman" w:eastAsia="Times New Roman" w:hAnsi="Times New Roman" w:cs="Times New Roman"/>
+          <w:color w:val="000000"/>
+          <w:sz w:val="24"/>
+          <w:szCs w:val="24"/>
+        </w:rPr>
+        <w:t xml:space="preserve"> </w:t>
+      </w:r>
+      <w:r>
+        <w:rPr>
+          <w:rFonts w:ascii="Times New Roman" w:hAnsi="Times New Roman" w:cs="Times New Roman"/>
+          <w:sz w:val="24"/>
+          <w:szCs w:val="24"/>
+        </w:rPr>
+        <w:t xml:space="preserve">Despite </w:t>
+      </w:r>
+      <w:r>
+        <w:rPr>
+          <w:rFonts w:ascii="Times New Roman" w:hAnsi="Times New Roman" w:cs="Times New Roman"/>
+          <w:sz w:val="24"/>
+          <w:szCs w:val="24"/>
+        </w:rPr>
+        <w:t>this emphasis</w:t>
+      </w:r>
+      <w:r>
+        <w:rPr>
+          <w:rFonts w:ascii="Times New Roman" w:hAnsi="Times New Roman" w:cs="Times New Roman"/>
+          <w:sz w:val="24"/>
+          <w:szCs w:val="24"/>
+        </w:rPr>
+        <w:t xml:space="preserve"> very few refugees achieve a livable wage by the time they have been in the United States for five years</w:t>
+      </w:r>
+      <w:r>
+        <w:rPr>
+          <w:rFonts w:ascii="Times New Roman" w:hAnsi="Times New Roman" w:cs="Times New Roman"/>
+          <w:sz w:val="24"/>
+          <w:szCs w:val="24"/>
+        </w:rPr>
+        <w:t>.</w:t>
+      </w:r>
+      <w:r>
+        <w:rPr>
+          <w:rFonts w:ascii="Times New Roman" w:hAnsi="Times New Roman" w:cs="Times New Roman"/>
+          <w:sz w:val="24"/>
+          <w:szCs w:val="24"/>
+        </w:rPr>
+        <w:t xml:space="preserve"> When Young</w:t>
+      </w:r>
+      <w:r>
+        <w:rPr>
+          <w:rFonts w:ascii="Times New Roman" w:hAnsi="Times New Roman" w:cs="Times New Roman"/>
+          <w:sz w:val="24"/>
+          <w:szCs w:val="24"/>
+        </w:rPr>
+        <w:t xml:space="preserve"> (20</w:t>
+      </w:r>
+      <w:r>
+        <w:rPr>
+          <w:rFonts w:ascii="Times New Roman" w:hAnsi="Times New Roman" w:cs="Times New Roman"/>
+          <w:sz w:val="24"/>
+          <w:szCs w:val="24"/>
+        </w:rPr>
+        <w:t>20</w:t>
+      </w:r>
+      <w:r>
+        <w:rPr>
+          <w:rFonts w:ascii="Times New Roman" w:hAnsi="Times New Roman" w:cs="Times New Roman"/>
+          <w:sz w:val="24"/>
+          <w:szCs w:val="24"/>
+        </w:rPr>
+        <w:t>)</w:t>
+      </w:r>
+      <w:r>
+        <w:rPr>
+          <w:rFonts w:ascii="Times New Roman" w:hAnsi="Times New Roman" w:cs="Times New Roman"/>
+          <w:sz w:val="24"/>
+          <w:szCs w:val="24"/>
+        </w:rPr>
+        <w:t xml:space="preserve"> studied</w:t>
+      </w:r>
+      <w:r>
+        <w:rPr>
+          <w:rFonts w:ascii="Times New Roman" w:hAnsi="Times New Roman" w:cs="Times New Roman"/>
+          <w:sz w:val="24"/>
+          <w:szCs w:val="24"/>
+        </w:rPr>
+        <w:t xml:space="preserve"> </w:t>
+      </w:r>
+      <w:r>
+        <w:rPr>
+          <w:rFonts w:ascii="Times New Roman" w:hAnsi="Times New Roman" w:cs="Times New Roman"/>
+          <w:sz w:val="24"/>
+          <w:szCs w:val="24"/>
+        </w:rPr>
+        <w:t>refugees resettled to Utah</w:t>
+      </w:r>
+      <w:r>
+        <w:rPr>
+          <w:rFonts w:ascii="Times New Roman" w:hAnsi="Times New Roman" w:cs="Times New Roman"/>
+          <w:sz w:val="24"/>
+          <w:szCs w:val="24"/>
+        </w:rPr>
+        <w:t xml:space="preserve"> in the past five years</w:t>
+      </w:r>
+      <w:r>
+        <w:rPr>
+          <w:rFonts w:ascii="Times New Roman" w:hAnsi="Times New Roman" w:cs="Times New Roman"/>
+          <w:sz w:val="24"/>
+          <w:szCs w:val="24"/>
+        </w:rPr>
+        <w:t>, she found</w:t>
+      </w:r>
+      <w:r>
+        <w:rPr>
+          <w:rFonts w:ascii="Times New Roman" w:hAnsi="Times New Roman" w:cs="Times New Roman"/>
+          <w:sz w:val="24"/>
+          <w:szCs w:val="24"/>
+        </w:rPr>
+        <w:t xml:space="preserve"> </w:t>
+      </w:r>
+      <w:r>
+        <w:rPr>
+          <w:rFonts w:ascii="Times New Roman" w:hAnsi="Times New Roman" w:cs="Times New Roman"/>
+          <w:sz w:val="24"/>
+          <w:szCs w:val="24"/>
+        </w:rPr>
+        <w:t>o</w:t>
+      </w:r>
+      <w:r>
+        <w:rPr>
+          <w:rFonts w:ascii="Times New Roman" w:hAnsi="Times New Roman" w:cs="Times New Roman"/>
+          <w:sz w:val="24"/>
+          <w:szCs w:val="24"/>
+        </w:rPr>
+        <w:t>nly eight percent</w:t>
+      </w:r>
+      <w:r>
+        <w:rPr>
+          <w:rFonts w:ascii="Times New Roman" w:hAnsi="Times New Roman" w:cs="Times New Roman"/>
+          <w:sz w:val="24"/>
+          <w:szCs w:val="24"/>
+        </w:rPr>
+        <w:t xml:space="preserve"> </w:t>
+      </w:r>
+      <w:r>
+        <w:rPr>
+          <w:rFonts w:ascii="Times New Roman" w:hAnsi="Times New Roman" w:cs="Times New Roman"/>
+          <w:sz w:val="24"/>
+          <w:szCs w:val="24"/>
+        </w:rPr>
+        <w:t>had found jobs with a livable hourly wage, and only six percent had found livable-wage jobs that offered full-time hours.</w:t>
+      </w:r>
+    </w:p>
+    <w:p>
+      <w:pPr>
+        <w:spacing w:before="240" w:after="240" w:line="480" w:lineRule="auto"/>
+        <w:ind w:firstLine="720"/>
+        <w:rPr>
+          <w:rFonts w:ascii="Times New Roman" w:eastAsia="Times New Roman" w:hAnsi="Times New Roman" w:cs="Times New Roman"/>
+          <w:sz w:val="24"/>
+          <w:szCs w:val="24"/>
+        </w:rPr>
+      </w:pPr>
+      <w:r>
+        <w:rPr>
+          <w:rFonts w:ascii="Times New Roman" w:eastAsia="Times New Roman" w:hAnsi="Times New Roman" w:cs="Times New Roman"/>
+          <w:color w:val="000000"/>
+          <w:sz w:val="24"/>
+          <w:szCs w:val="24"/>
+        </w:rPr>
+        <w:t>Despite th</w:t>
+      </w:r>
+      <w:r>
+        <w:rPr>
+          <w:rFonts w:ascii="Times New Roman" w:eastAsia="Times New Roman" w:hAnsi="Times New Roman" w:cs="Times New Roman"/>
+          <w:color w:val="000000"/>
+          <w:sz w:val="24"/>
+          <w:szCs w:val="24"/>
+        </w:rPr>
+        <w:t>is</w:t>
+      </w:r>
+      <w:r>
+        <w:rPr>
+          <w:rFonts w:ascii="Times New Roman" w:eastAsia="Times New Roman" w:hAnsi="Times New Roman" w:cs="Times New Roman"/>
+          <w:color w:val="000000"/>
+          <w:sz w:val="24"/>
+          <w:szCs w:val="24"/>
+        </w:rPr>
+        <w:t xml:space="preserve"> difficulty, j</w:t>
+      </w:r>
+      <w:r>
+        <w:rPr>
+          <w:rFonts w:ascii="Times New Roman" w:eastAsia="Times New Roman" w:hAnsi="Times New Roman" w:cs="Times New Roman"/>
+          <w:color w:val="000000"/>
+          <w:sz w:val="24"/>
+          <w:szCs w:val="24"/>
+        </w:rPr>
+        <w:t>ob</w:t>
+      </w:r>
+      <w:r>
+        <w:rPr>
+          <w:rFonts w:ascii="Times New Roman" w:eastAsia="Times New Roman" w:hAnsi="Times New Roman" w:cs="Times New Roman"/>
+          <w:color w:val="000000"/>
+          <w:sz w:val="24"/>
+          <w:szCs w:val="24"/>
+        </w:rPr>
+        <w:t>s</w:t>
+      </w:r>
+      <w:r>
+        <w:rPr>
+          <w:rFonts w:ascii="Times New Roman" w:eastAsia="Times New Roman" w:hAnsi="Times New Roman" w:cs="Times New Roman"/>
+          <w:color w:val="000000"/>
+          <w:sz w:val="24"/>
+          <w:szCs w:val="24"/>
+        </w:rPr>
+        <w:t xml:space="preserve"> meet</w:t>
+      </w:r>
+      <w:r>
+        <w:rPr>
+          <w:rFonts w:ascii="Times New Roman" w:eastAsia="Times New Roman" w:hAnsi="Times New Roman" w:cs="Times New Roman"/>
+          <w:color w:val="000000"/>
+          <w:sz w:val="24"/>
+          <w:szCs w:val="24"/>
+        </w:rPr>
+        <w:t>ing</w:t>
+      </w:r>
+      <w:r>
+        <w:rPr>
+          <w:rFonts w:ascii="Times New Roman" w:eastAsia="Times New Roman" w:hAnsi="Times New Roman" w:cs="Times New Roman"/>
+          <w:color w:val="000000"/>
+          <w:sz w:val="24"/>
+          <w:szCs w:val="24"/>
+        </w:rPr>
+        <w:t xml:space="preserve"> the household’s needs </w:t>
+      </w:r>
+      <w:r>
+        <w:rPr>
+          <w:rFonts w:ascii="Times New Roman" w:eastAsia="Times New Roman" w:hAnsi="Times New Roman" w:cs="Times New Roman"/>
+          <w:color w:val="000000"/>
+          <w:sz w:val="24"/>
+          <w:szCs w:val="24"/>
+        </w:rPr>
+        <w:t>are</w:t>
+      </w:r>
+      <w:r>
+        <w:rPr>
+          <w:rFonts w:ascii="Times New Roman" w:eastAsia="Times New Roman" w:hAnsi="Times New Roman" w:cs="Times New Roman"/>
+          <w:color w:val="000000"/>
+          <w:sz w:val="24"/>
+          <w:szCs w:val="24"/>
+        </w:rPr>
+        <w:t xml:space="preserve"> critical.</w:t>
+      </w:r>
+      <w:r>
+        <w:rPr>
+          <w:rFonts w:ascii="Times New Roman" w:eastAsia="Times New Roman" w:hAnsi="Times New Roman" w:cs="Times New Roman"/>
+          <w:color w:val="000000"/>
+          <w:sz w:val="24"/>
+          <w:szCs w:val="24"/>
+        </w:rPr>
+        <w:t xml:space="preserve"> </w:t>
+      </w:r>
+      <w:r>
+        <w:rPr>
+          <w:rFonts w:ascii="Times New Roman" w:eastAsia="Times New Roman" w:hAnsi="Times New Roman" w:cs="Times New Roman"/>
+          <w:color w:val="000000"/>
+          <w:sz w:val="24"/>
+          <w:szCs w:val="24"/>
+        </w:rPr>
+        <w:t xml:space="preserve">Refugees receive rent, food, and job search assistance for 30-90 </w:t>
       </w:r>
       <w:r>
         <w:rPr>
@@ -971,7 +1154,17 @@
             <w:sz w:val="24"/>
             <w:szCs w:val="24"/>
           </w:rPr>
-          <w:t>(Nam et al. 2021)</w:t>
+          <w:t xml:space="preserve">(Nam et </w:t>
+        </w:r>
+        <w:r>
+          <w:rPr>
+            <w:rFonts w:ascii="Times New Roman" w:eastAsia="Times New Roman" w:hAnsi="Times New Roman" w:cs="Times New Roman"/>
+            <w:color w:val="000000"/>
+            <w:sz w:val="24"/>
+            <w:szCs w:val="24"/>
+          </w:rPr>
+          <w:lastRenderedPageBreak/>
+          <w:t>al. 2021)</w:t>
         </w:r>
       </w:hyperlink>
       <w:r>
@@ -999,16 +1192,7 @@
             <w:sz w:val="24"/>
             <w:szCs w:val="24"/>
           </w:rPr>
-          <w:t xml:space="preserve">(Tran and </w:t>
-        </w:r>
-        <w:r>
-          <w:rPr>
-            <w:rFonts w:ascii="Times New Roman" w:eastAsia="Times New Roman" w:hAnsi="Times New Roman" w:cs="Times New Roman"/>
-            <w:sz w:val="24"/>
-            <w:szCs w:val="24"/>
-          </w:rPr>
-          <w:lastRenderedPageBreak/>
-          <w:t>Lara-García 2020)</w:t>
+          <w:t>(Tran and Lara-García 2020)</w:t>
         </w:r>
       </w:hyperlink>
       <w:r>
@@ -1051,7 +1235,7 @@
           <w:sz w:val="24"/>
           <w:szCs w:val="24"/>
         </w:rPr>
-        <w:t>.  </w:t>
+        <w:t>. </w:t>
       </w:r>
     </w:p>
     <w:p>
@@ -1070,6 +1254,25 @@
           <w:sz w:val="24"/>
           <w:szCs w:val="24"/>
         </w:rPr>
+        <w:t>START HERE</w:t>
+      </w:r>
+    </w:p>
+    <w:p>
+      <w:pPr>
+        <w:spacing w:before="240" w:after="240" w:line="480" w:lineRule="auto"/>
+        <w:ind w:firstLine="720"/>
+        <w:rPr>
+          <w:rFonts w:ascii="Times New Roman" w:eastAsia="Times New Roman" w:hAnsi="Times New Roman" w:cs="Times New Roman"/>
+          <w:sz w:val="24"/>
+          <w:szCs w:val="24"/>
+        </w:rPr>
+      </w:pPr>
+      <w:r>
+        <w:rPr>
+          <w:rFonts w:ascii="Times New Roman" w:eastAsia="Times New Roman" w:hAnsi="Times New Roman" w:cs="Times New Roman"/>
+          <w:sz w:val="24"/>
+          <w:szCs w:val="24"/>
+        </w:rPr>
         <w:t>Some refugee research argues for “the blank slate hypothesis” or the tendency for the pre-settlement contexts and experiences to have no impact on resettlement</w:t>
       </w:r>
       <w:r>
@@ -1493,43 +1696,7 @@
           <w:sz w:val="24"/>
           <w:szCs w:val="24"/>
         </w:rPr>
-        <w:t xml:space="preserve"> to assimilating in other areas (</w:t>
-      </w:r>
-      <w:proofErr w:type="spellStart"/>
-      <w:r>
-        <w:rPr>
-          <w:rFonts w:ascii="Times New Roman" w:eastAsia="Times New Roman" w:hAnsi="Times New Roman" w:cs="Times New Roman"/>
-          <w:sz w:val="24"/>
-          <w:szCs w:val="24"/>
-        </w:rPr>
-        <w:t>Hobfoll</w:t>
-      </w:r>
-      <w:proofErr w:type="spellEnd"/>
-      <w:r>
-        <w:rPr>
-          <w:rFonts w:ascii="Times New Roman" w:eastAsia="Times New Roman" w:hAnsi="Times New Roman" w:cs="Times New Roman"/>
-          <w:sz w:val="24"/>
-          <w:szCs w:val="24"/>
-        </w:rPr>
-        <w:t xml:space="preserve"> 1989; </w:t>
-      </w:r>
-      <w:proofErr w:type="spellStart"/>
-      <w:r>
-        <w:rPr>
-          <w:rFonts w:ascii="Times New Roman" w:eastAsia="Times New Roman" w:hAnsi="Times New Roman" w:cs="Times New Roman"/>
-          <w:sz w:val="24"/>
-          <w:szCs w:val="24"/>
-        </w:rPr>
-        <w:t>Hobfoll</w:t>
-      </w:r>
-      <w:proofErr w:type="spellEnd"/>
-      <w:r>
-        <w:rPr>
-          <w:rFonts w:ascii="Times New Roman" w:eastAsia="Times New Roman" w:hAnsi="Times New Roman" w:cs="Times New Roman"/>
-          <w:sz w:val="24"/>
-          <w:szCs w:val="24"/>
-        </w:rPr>
-        <w:t xml:space="preserve"> et al. 2018; Strang and Ager 2010). For example, when refugees obtain jobs, they often work in areas where they interact with others in the host context language. This increases the refugee’s language skills, which in turn could increase refugee access to host context information.</w:t>
+        <w:t xml:space="preserve"> to assimilating in other areas (Hobfoll 1989; Hobfoll et al. 2018; Strang and Ager 2010). For example, when refugees obtain jobs, they often work in areas where they interact with others in the host context language. This increases the refugee’s language skills, which in turn could increase refugee access to host context information.</w:t>
       </w:r>
     </w:p>
     <w:p>
@@ -1614,7 +1781,16 @@
           <w:sz w:val="24"/>
           <w:szCs w:val="24"/>
         </w:rPr>
-        <w:t xml:space="preserve">the blank slate hypothesis’s predictions. </w:t>
+        <w:t xml:space="preserve">the blank slate hypothesis’s </w:t>
+      </w:r>
+      <w:r>
+        <w:rPr>
+          <w:rFonts w:ascii="Times New Roman" w:eastAsia="Times New Roman" w:hAnsi="Times New Roman" w:cs="Times New Roman"/>
+          <w:sz w:val="24"/>
+          <w:szCs w:val="24"/>
+        </w:rPr>
+        <w:lastRenderedPageBreak/>
+        <w:t xml:space="preserve">predictions. </w:t>
       </w:r>
       <w:r>
         <w:rPr>
@@ -1678,16 +1854,7 @@
           <w:sz w:val="24"/>
           <w:szCs w:val="24"/>
         </w:rPr>
-        <w:t xml:space="preserve"> for their arrival, they choose </w:t>
-      </w:r>
-      <w:r>
-        <w:rPr>
-          <w:rFonts w:ascii="Times New Roman" w:eastAsia="Times New Roman" w:hAnsi="Times New Roman" w:cs="Times New Roman"/>
-          <w:sz w:val="24"/>
-          <w:szCs w:val="24"/>
-        </w:rPr>
-        <w:lastRenderedPageBreak/>
-        <w:t xml:space="preserve">where they are resettled to, and may have had privileged enough positions in their countries of origin to move of their own volition. </w:t>
+        <w:t xml:space="preserve"> for their arrival, they choose where they are resettled to, and may have had privileged enough positions in their countries of origin to move of their own volition. </w:t>
       </w:r>
     </w:p>
     <w:p>
@@ -2368,7 +2535,17 @@
           <w:sz w:val="24"/>
           <w:szCs w:val="24"/>
         </w:rPr>
-        <w:t>frequent the same places, and participate in the same events.</w:t>
+        <w:t xml:space="preserve">frequent the same places, and participate in the </w:t>
+      </w:r>
+      <w:r>
+        <w:rPr>
+          <w:rFonts w:ascii="Times New Roman" w:eastAsia="Times New Roman" w:hAnsi="Times New Roman" w:cs="Times New Roman"/>
+          <w:color w:val="000000"/>
+          <w:sz w:val="24"/>
+          <w:szCs w:val="24"/>
+        </w:rPr>
+        <w:lastRenderedPageBreak/>
+        <w:t>same events.</w:t>
       </w:r>
       <w:r>
         <w:rPr>
@@ -2521,7 +2698,6 @@
           <w:sz w:val="24"/>
           <w:szCs w:val="24"/>
         </w:rPr>
-        <w:lastRenderedPageBreak/>
         <w:tab/>
       </w:r>
       <w:r>
@@ -3275,27 +3451,7 @@
           <w:sz w:val="24"/>
           <w:szCs w:val="24"/>
         </w:rPr>
-        <w:t xml:space="preserve">the host context practices and their own, or into the permanent underclass by adopting </w:t>
-      </w:r>
-      <w:proofErr w:type="spellStart"/>
-      <w:r>
-        <w:rPr>
-          <w:rFonts w:ascii="Times New Roman" w:eastAsia="Times New Roman" w:hAnsi="Times New Roman" w:cs="Times New Roman"/>
-          <w:color w:val="000000"/>
-          <w:sz w:val="24"/>
-          <w:szCs w:val="24"/>
-        </w:rPr>
-        <w:t>a</w:t>
-      </w:r>
-      <w:proofErr w:type="spellEnd"/>
-      <w:r>
-        <w:rPr>
-          <w:rFonts w:ascii="Times New Roman" w:eastAsia="Times New Roman" w:hAnsi="Times New Roman" w:cs="Times New Roman"/>
-          <w:color w:val="000000"/>
-          <w:sz w:val="24"/>
-          <w:szCs w:val="24"/>
-        </w:rPr>
-        <w:t xml:space="preserve"> anti-mainstream narrative and rejecting the </w:t>
+        <w:t xml:space="preserve">the host context practices and their own, or into the permanent underclass by adopting a anti-mainstream narrative and rejecting the </w:t>
       </w:r>
       <w:r>
         <w:rPr>
@@ -3324,6 +3480,7 @@
           <w:sz w:val="24"/>
           <w:szCs w:val="24"/>
         </w:rPr>
+        <w:lastRenderedPageBreak/>
         <w:tab/>
         <w:t xml:space="preserve">There are several factors which affect which strata </w:t>
       </w:r>
@@ -3361,17 +3518,7 @@
           <w:sz w:val="24"/>
           <w:szCs w:val="24"/>
         </w:rPr>
-        <w:t xml:space="preserve">they note </w:t>
-      </w:r>
-      <w:r>
-        <w:rPr>
-          <w:rFonts w:ascii="Times New Roman" w:eastAsia="Times New Roman" w:hAnsi="Times New Roman" w:cs="Times New Roman"/>
-          <w:color w:val="000000"/>
-          <w:sz w:val="24"/>
-          <w:szCs w:val="24"/>
-        </w:rPr>
-        <w:lastRenderedPageBreak/>
-        <w:t>that</w:t>
+        <w:t>they note that</w:t>
       </w:r>
       <w:r>
         <w:rPr>
@@ -4014,7 +4161,16 @@
           <w:sz w:val="24"/>
           <w:szCs w:val="24"/>
         </w:rPr>
-        <w:t xml:space="preserve">The blank slate hypothesis often seen in refugee studies and the sociology of immigration’s segmented assimilation theory both assert that human capital will affect assimilation. However, the blank slate hypothesis posits that resettlement resets human capital and only human capital earned after resettlement will affect assimilation outcomes, contradicting hypothesis </w:t>
+        <w:t xml:space="preserve">The blank slate hypothesis often seen in refugee studies and the sociology of immigration’s segmented assimilation theory both assert that human capital will affect assimilation. However, the blank slate hypothesis posits that resettlement resets human capital and only human capital earned after resettlement will affect assimilation outcomes, contradicting </w:t>
+      </w:r>
+      <w:r>
+        <w:rPr>
+          <w:rFonts w:ascii="Times New Roman" w:hAnsi="Times New Roman" w:cs="Times New Roman"/>
+          <w:sz w:val="24"/>
+          <w:szCs w:val="24"/>
+        </w:rPr>
+        <w:lastRenderedPageBreak/>
+        <w:t xml:space="preserve">hypothesis </w:t>
       </w:r>
       <w:r>
         <w:rPr>
@@ -4049,7 +4205,6 @@
           <w:sz w:val="24"/>
           <w:szCs w:val="24"/>
         </w:rPr>
-        <w:lastRenderedPageBreak/>
         <w:t>Many researchers observe predictive power for education or work experience</w:t>
       </w:r>
       <w:r>
@@ -4704,7 +4859,16 @@
           <w:sz w:val="24"/>
           <w:szCs w:val="24"/>
         </w:rPr>
-        <w:t xml:space="preserve">ompared to Haitians—who also originate from the Caribbean and have enclaves in Miami. Another factor clearly visible in this example is the differing procedures required by the U.S. government. Cubans were given special privileges and supports that other migrants were not—including preferential treatment and pathways to permanent resident status not given to other groups </w:t>
+        <w:t xml:space="preserve">ompared to Haitians—who also originate from the Caribbean and have enclaves in Miami. Another factor clearly visible in this example is the differing procedures required by the U.S. government. Cubans were given special </w:t>
+      </w:r>
+      <w:r>
+        <w:rPr>
+          <w:rFonts w:ascii="Times New Roman" w:hAnsi="Times New Roman" w:cs="Times New Roman"/>
+          <w:sz w:val="24"/>
+          <w:szCs w:val="24"/>
+        </w:rPr>
+        <w:lastRenderedPageBreak/>
+        <w:t xml:space="preserve">privileges and supports that other migrants were not—including preferential treatment and pathways to permanent resident status not given to other groups </w:t>
       </w:r>
       <w:r>
         <w:rPr>
@@ -4770,7 +4934,6 @@
           <w:sz w:val="24"/>
           <w:szCs w:val="24"/>
         </w:rPr>
-        <w:lastRenderedPageBreak/>
         <w:t>Portes and Zhou (1993) also describe how in places with racism, like the United States, skin color will negatively shape how natives interact with some households. This stratifies outcomes</w:t>
       </w:r>
       <w:r>
@@ -5357,7 +5520,7 @@
           <w:sz w:val="24"/>
           <w:szCs w:val="24"/>
         </w:rPr>
-        <w:t xml:space="preserve"> available in the host-context should affect assimilation outcomes. Because assimilation is becoming like members of the host context, much of assimilation is about obtaining resources like money or housing. Front-loading, </w:t>
+        <w:t xml:space="preserve"> available in the host-context should affect assimilation outcomes. Because assimilation is becoming like members of the host </w:t>
       </w:r>
       <w:r>
         <w:rPr>
@@ -5366,7 +5529,7 @@
           <w:szCs w:val="24"/>
         </w:rPr>
         <w:lastRenderedPageBreak/>
-        <w:t xml:space="preserve">or furnishing resources to refugees before the situation becomes more difficult is recommended by refugee researchers </w:t>
+        <w:t xml:space="preserve">context, much of assimilation is about obtaining resources like money or housing. Front-loading, or furnishing resources to refugees before the situation becomes more difficult is recommended by refugee researchers </w:t>
       </w:r>
       <w:r>
         <w:rPr>
@@ -6007,7 +6170,17 @@
           <w:sz w:val="24"/>
           <w:szCs w:val="24"/>
         </w:rPr>
-        <w:t xml:space="preserve"> counted as refugees and refugees from country/pairs not included in the analysis are not counted at all. Thus, the </w:t>
+        <w:t xml:space="preserve"> counted as refugees and refugees from country/pairs not included in the </w:t>
+      </w:r>
+      <w:r>
+        <w:rPr>
+          <w:rFonts w:ascii="Times New Roman" w:eastAsia="Times New Roman" w:hAnsi="Times New Roman" w:cs="Times New Roman"/>
+          <w:color w:val="000000"/>
+          <w:sz w:val="24"/>
+          <w:szCs w:val="24"/>
+        </w:rPr>
+        <w:lastRenderedPageBreak/>
+        <w:t xml:space="preserve">analysis are not counted at all. Thus, the </w:t>
       </w:r>
       <w:r>
         <w:rPr>
@@ -6034,17 +6207,7 @@
           <w:sz w:val="24"/>
           <w:szCs w:val="24"/>
         </w:rPr>
-        <w:t xml:space="preserve">—if not </w:t>
-      </w:r>
-      <w:r>
-        <w:rPr>
-          <w:rFonts w:ascii="Times New Roman" w:eastAsia="Times New Roman" w:hAnsi="Times New Roman" w:cs="Times New Roman"/>
-          <w:color w:val="000000"/>
-          <w:sz w:val="24"/>
-          <w:szCs w:val="24"/>
-        </w:rPr>
-        <w:lastRenderedPageBreak/>
-        <w:t>impossible—</w:t>
+        <w:t>—if not impossible—</w:t>
       </w:r>
       <w:r>
         <w:rPr>
@@ -11440,23 +11603,13 @@
         </w:rPr>
         <w:t xml:space="preserve"> at </w:t>
       </w:r>
-      <w:proofErr w:type="spellStart"/>
-      <w:r>
-        <w:rPr>
-          <w:rFonts w:ascii="Times New Roman" w:eastAsia="Times New Roman" w:hAnsi="Times New Roman" w:cs="Times New Roman"/>
-          <w:sz w:val="24"/>
-          <w:szCs w:val="24"/>
-        </w:rPr>
-        <w:t>at</w:t>
-      </w:r>
-      <w:proofErr w:type="spellEnd"/>
-      <w:r>
-        <w:rPr>
-          <w:rFonts w:ascii="Times New Roman" w:eastAsia="Times New Roman" w:hAnsi="Times New Roman" w:cs="Times New Roman"/>
-          <w:sz w:val="24"/>
-          <w:szCs w:val="24"/>
-        </w:rPr>
-        <w:t xml:space="preserve"> least the 90</w:t>
+      <w:r>
+        <w:rPr>
+          <w:rFonts w:ascii="Times New Roman" w:eastAsia="Times New Roman" w:hAnsi="Times New Roman" w:cs="Times New Roman"/>
+          <w:sz w:val="24"/>
+          <w:szCs w:val="24"/>
+        </w:rPr>
+        <w:t>at least the 90</w:t>
       </w:r>
       <w:r>
         <w:rPr>
@@ -12005,27 +12158,7 @@
           <w:sz w:val="24"/>
           <w:szCs w:val="24"/>
         </w:rPr>
-        <w:t xml:space="preserve"> </w:t>
-      </w:r>
-      <w:proofErr w:type="spellStart"/>
-      <w:r>
-        <w:rPr>
-          <w:rFonts w:ascii="Times New Roman" w:eastAsia="Times New Roman" w:hAnsi="Times New Roman" w:cs="Times New Roman"/>
-          <w:color w:val="000000" w:themeColor="text1"/>
-          <w:sz w:val="24"/>
-          <w:szCs w:val="24"/>
-        </w:rPr>
-        <w:t>Hobfoll</w:t>
-      </w:r>
-      <w:proofErr w:type="spellEnd"/>
-      <w:r>
-        <w:rPr>
-          <w:rFonts w:ascii="Times New Roman" w:eastAsia="Times New Roman" w:hAnsi="Times New Roman" w:cs="Times New Roman"/>
-          <w:color w:val="000000" w:themeColor="text1"/>
-          <w:sz w:val="24"/>
-          <w:szCs w:val="24"/>
-        </w:rPr>
-        <w:t xml:space="preserve"> </w:t>
+        <w:t xml:space="preserve"> Hobfoll </w:t>
       </w:r>
       <w:r>
         <w:rPr>
@@ -17983,7 +18116,7 @@
 </file>
 
 <file path=word/numbering.xml><?xml version="1.0" encoding="utf-8"?>
-<w:numbering xmlns:wpc="http://schemas.microsoft.com/office/word/2010/wordprocessingCanvas" xmlns:cx="http://schemas.microsoft.com/office/drawing/2014/chartex" xmlns:cx1="http://schemas.microsoft.com/office/drawing/2015/9/8/chartex" xmlns:cx2="http://schemas.microsoft.com/office/drawing/2015/10/21/chartex" xmlns:cx3="http://schemas.microsoft.com/office/drawing/2016/5/9/chartex" xmlns:cx4="http://schemas.microsoft.com/office/drawing/2016/5/10/chartex" xmlns:cx5="http://schemas.microsoft.com/office/drawing/2016/5/11/chartex" xmlns:cx6="http://schemas.microsoft.com/office/drawing/2016/5/12/chartex" xmlns:cx7="http://schemas.microsoft.com/office/drawing/2016/5/13/chartex" xmlns:cx8="http://schemas.microsoft.com/office/drawing/2016/5/14/chartex" xmlns:mc="http://schemas.openxmlformats.org/markup-compatibility/2006" xmlns:aink="http://schemas.microsoft.com/office/drawing/2016/ink" xmlns:am3d="http://schemas.microsoft.com/office/drawing/2017/model3d" xmlns:o="urn:schemas-microsoft-com:office:office" xmlns:oel="http://schemas.microsoft.com/office/2019/extlst" xmlns:r="http://schemas.openxmlformats.org/officeDocument/2006/relationships" xmlns:m="http://schemas.openxmlformats.org/officeDocument/2006/math" xmlns:v="urn:schemas-microsoft-com:vml" xmlns:wp14="http://schemas.microsoft.com/office/word/2010/wordprocessingDrawing" xmlns:wp="http://schemas.openxmlformats.org/drawingml/2006/wordprocessingDrawing" xmlns:w10="urn:schemas-microsoft-com:office:word" xmlns:w="http://schemas.openxmlformats.org/wordprocessingml/2006/main" xmlns:w14="http://schemas.microsoft.com/office/word/2010/wordml" xmlns:w15="http://schemas.microsoft.com/office/word/2012/wordml" xmlns:w16cex="http://schemas.microsoft.com/office/word/2018/wordml/cex" xmlns:w16cid="http://schemas.microsoft.com/office/word/2016/wordml/cid" xmlns:w16="http://schemas.microsoft.com/office/word/2018/wordml" xmlns:w16sdtdh="http://schemas.microsoft.com/office/word/2020/wordml/sdtdatahash" xmlns:w16se="http://schemas.microsoft.com/office/word/2015/wordml/symex" xmlns:wpg="http://schemas.microsoft.com/office/word/2010/wordprocessingGroup" xmlns:wpi="http://schemas.microsoft.com/office/word/2010/wordprocessingInk" xmlns:wne="http://schemas.microsoft.com/office/word/2006/wordml" xmlns:wps="http://schemas.microsoft.com/office/word/2010/wordprocessingShape" mc:Ignorable="w14 w15 w16se w16cid w16 w16cex w16sdtdh wp14">
+<w:numbering xmlns:wpc="http://schemas.microsoft.com/office/word/2010/wordprocessingCanvas" xmlns:cx="http://schemas.microsoft.com/office/drawing/2014/chartex" xmlns:cx1="http://schemas.microsoft.com/office/drawing/2015/9/8/chartex" xmlns:cx2="http://schemas.microsoft.com/office/drawing/2015/10/21/chartex" xmlns:cx3="http://schemas.microsoft.com/office/drawing/2016/5/9/chartex" xmlns:cx4="http://schemas.microsoft.com/office/drawing/2016/5/10/chartex" xmlns:cx5="http://schemas.microsoft.com/office/drawing/2016/5/11/chartex" xmlns:cx6="http://schemas.microsoft.com/office/drawing/2016/5/12/chartex" xmlns:cx7="http://schemas.microsoft.com/office/drawing/2016/5/13/chartex" xmlns:cx8="http://schemas.microsoft.com/office/drawing/2016/5/14/chartex" xmlns:mc="http://schemas.openxmlformats.org/markup-compatibility/2006" xmlns:aink="http://schemas.microsoft.com/office/drawing/2016/ink" xmlns:am3d="http://schemas.microsoft.com/office/drawing/2017/model3d" xmlns:o="urn:schemas-microsoft-com:office:office" xmlns:oel="http://schemas.microsoft.com/office/2019/extlst" xmlns:r="http://schemas.openxmlformats.org/officeDocument/2006/relationships" xmlns:m="http://schemas.openxmlformats.org/officeDocument/2006/math" xmlns:v="urn:schemas-microsoft-com:vml" xmlns:wp14="http://schemas.microsoft.com/office/word/2010/wordprocessingDrawing" xmlns:wp="http://schemas.openxmlformats.org/drawingml/2006/wordprocessingDrawing" xmlns:w10="urn:schemas-microsoft-com:office:word" xmlns:w="http://schemas.openxmlformats.org/wordprocessingml/2006/main" xmlns:w14="http://schemas.microsoft.com/office/word/2010/wordml" xmlns:w15="http://schemas.microsoft.com/office/word/2012/wordml" xmlns:w16cex="http://schemas.microsoft.com/office/word/2018/wordml/cex" xmlns:w16cid="http://schemas.microsoft.com/office/word/2016/wordml/cid" xmlns:w16="http://schemas.microsoft.com/office/word/2018/wordml" xmlns:w16du="http://schemas.microsoft.com/office/word/2023/wordml/word16du" xmlns:w16sdtdh="http://schemas.microsoft.com/office/word/2020/wordml/sdtdatahash" xmlns:w16se="http://schemas.microsoft.com/office/word/2015/wordml/symex" xmlns:wpg="http://schemas.microsoft.com/office/word/2010/wordprocessingGroup" xmlns:wpi="http://schemas.microsoft.com/office/word/2010/wordprocessingInk" xmlns:wne="http://schemas.microsoft.com/office/word/2006/wordml" xmlns:wps="http://schemas.microsoft.com/office/word/2010/wordprocessingShape" mc:Ignorable="w14 w15 w16se w16cid w16 w16cex w16sdtdh w16du wp14">
   <w:abstractNum w:abstractNumId="0" w15:restartNumberingAfterBreak="0">
     <w:nsid w:val="61DF6322"/>
     <w:multiLevelType w:val="multilevel"/>
@@ -18104,7 +18237,7 @@
 </file>
 
 <file path=word/styles.xml><?xml version="1.0" encoding="utf-8"?>
-<w:styles xmlns:mc="http://schemas.openxmlformats.org/markup-compatibility/2006" xmlns:r="http://schemas.openxmlformats.org/officeDocument/2006/relationships" xmlns:w="http://schemas.openxmlformats.org/wordprocessingml/2006/main" xmlns:w14="http://schemas.microsoft.com/office/word/2010/wordml" xmlns:w15="http://schemas.microsoft.com/office/word/2012/wordml" xmlns:w16cex="http://schemas.microsoft.com/office/word/2018/wordml/cex" xmlns:w16cid="http://schemas.microsoft.com/office/word/2016/wordml/cid" xmlns:w16="http://schemas.microsoft.com/office/word/2018/wordml" xmlns:w16sdtdh="http://schemas.microsoft.com/office/word/2020/wordml/sdtdatahash" xmlns:w16se="http://schemas.microsoft.com/office/word/2015/wordml/symex" mc:Ignorable="w14 w15 w16se w16cid w16 w16cex w16sdtdh">
+<w:styles xmlns:mc="http://schemas.openxmlformats.org/markup-compatibility/2006" xmlns:r="http://schemas.openxmlformats.org/officeDocument/2006/relationships" xmlns:w="http://schemas.openxmlformats.org/wordprocessingml/2006/main" xmlns:w14="http://schemas.microsoft.com/office/word/2010/wordml" xmlns:w15="http://schemas.microsoft.com/office/word/2012/wordml" xmlns:w16cex="http://schemas.microsoft.com/office/word/2018/wordml/cex" xmlns:w16cid="http://schemas.microsoft.com/office/word/2016/wordml/cid" xmlns:w16="http://schemas.microsoft.com/office/word/2018/wordml" xmlns:w16du="http://schemas.microsoft.com/office/word/2023/wordml/word16du" xmlns:w16sdtdh="http://schemas.microsoft.com/office/word/2020/wordml/sdtdatahash" xmlns:w16se="http://schemas.microsoft.com/office/word/2015/wordml/symex" mc:Ignorable="w14 w15 w16se w16cid w16 w16cex w16sdtdh w16du">
   <w:docDefaults>
     <w:rPrDefault>
       <w:rPr>

</xml_diff>